<commit_message>
fix: expose native diagnostic stages and finalize T2-15 acceptance
</commit_message>
<xml_diff>
--- a/docs/evidence/plan2/T2-15/native-combination.docx
+++ b/docs/evidence/plan2/T2-15/native-combination.docx
@@ -41,7 +41,7 @@
         <w:spacing w:after="130"/>
       </w:pPr>
       <w:r>
-        <w:t xml:space="preserve">分析 ID analysis_d8f74b63-7e6e-4ab4-b06b-be22a2385cae；输入修订 R12；状态 已完成</w:t>
+        <w:t xml:space="preserve">分析 ID analysis_57aac882-359e-4bcf-873d-ef2a408452c5；输入修订 R12；状态 已完成</w:t>
       </w:r>
     </w:p>
     <w:p>
@@ -49,7 +49,7 @@
         <w:spacing w:after="130"/>
       </w:pPr>
       <w:r>
-        <w:t xml:space="preserve">分析时间 2026-10-05T09:38:11Z；报告生成时间 2026-10-05T09:38:12.410Z（ISO 8601）</w:t>
+        <w:t xml:space="preserve">分析时间 2026-10-05T09:51:03Z；报告生成时间 2026-10-05T09:51:04.578Z（ISO 8601）</w:t>
       </w:r>
     </w:p>
     <w:p>
@@ -57,7 +57,7 @@
         <w:spacing w:after="130"/>
       </w:pPr>
       <w:r>
-        <w:t xml:space="preserve">运行来源 formal-model；请求 request_657520d4-ae23-45b0-9589-5f5cbbde1a19；实际阶段 模型检查 (2026-10-05T09:38:11Z) → 刚度组装 (2026-10-05T09:38:11Z) → 方程求解 (2026-10-05T09:38:11Z) → 结果恢复 (2026-10-05T09:38:11Z)。</w:t>
+        <w:t xml:space="preserve">运行来源 formal-model；请求 request_9d7c2e1b-9c51-42bc-a1a0-7b42e0abfbcd；实际阶段 模型检查 (2026-10-05T09:51:03Z) → 刚度组装 (2026-10-05T09:51:03Z) → 方程求解 (2026-10-05T09:51:03Z) → 结果恢复 (2026-10-05T09:51:03Z)。</w:t>
       </w:r>
     </w:p>
     <w:p>
@@ -6371,7 +6371,7 @@
         <w:spacing w:after="130"/>
       </w:pPr>
       <w:r>
-        <w:t xml:space="preserve">正文来源分析 analysis_d8f74b63-7e6e-4ab4-b06b-be22a2385cae；输入修订 R12；CB1 · Independent combination · 用户定义组合。</w:t>
+        <w:t xml:space="preserve">正文来源分析 analysis_57aac882-359e-4bcf-873d-ef2a408452c5；输入修订 R12；CB1 · Independent combination · 用户定义组合。</w:t>
       </w:r>
     </w:p>
     <w:p>
@@ -6413,7 +6413,7 @@
         <w:spacing w:after="130"/>
       </w:pPr>
       <w:r>
-        <w:t xml:space="preserve">按冻结输入重建 · 分析 analysis_d8f74b63-7e6e-4ab4-b06b-be22a2385cae；位移与杆端力来自该分析的已保存结果。</w:t>
+        <w:t xml:space="preserve">按冻结输入重建 · 分析 analysis_57aac882-359e-4bcf-873d-ef2a408452c5；位移与杆端力来自该分析的已保存结果。</w:t>
       </w:r>
     </w:p>
     <w:p>
@@ -24995,7 +24995,7 @@
         <w:spacing w:after="130"/>
       </w:pPr>
       <w:r>
-        <w:t xml:space="preserve">本次运行实际快照 · 分析 analysis_d8f74b63-7e6e-4ab4-b06b-be22a2385cae</w:t>
+        <w:t xml:space="preserve">本次运行实际快照 · 分析 analysis_57aac882-359e-4bcf-873d-ef2a408452c5</w:t>
       </w:r>
     </w:p>
     <w:p>

</xml_diff>